<commit_message>
docs: polish code and report into natural student submission style
</commit_message>
<xml_diff>
--- a/Gold_Price_Regression_Report.docx
+++ b/Gold_Price_Regression_Report.docx
@@ -9,48 +9,43 @@
       </w:pPr>
       <w:r>
         <w:rPr>
-          <w:rFonts w:ascii="Arial" w:hAnsi="Arial"/>
+          <w:rFonts w:ascii="B Nazanin" w:hAnsi="B Nazanin"/>
           <w:b/>
-          <w:color w:val="1A365D"/>
           <w:sz w:val="28"/>
         </w:rPr>
-        <w:t>Urmia University - Faculty of Engineering</w:t>
+        <w:t>دانشگاه ارومیه - دانشکده فنی و مهندسی</w:t>
         <w:br/>
-        <w:t>Department of Computer Engineering</w:t>
+        <w:t>گروه مهندسی کامپیوتر</w:t>
+        <w:br/>
       </w:r>
     </w:p>
     <w:p>
       <w:pPr>
-        <w:spacing w:after="280"/>
+        <w:spacing w:after="120"/>
         <w:jc w:val="center"/>
       </w:pPr>
       <w:r>
         <w:rPr>
-          <w:rFonts w:ascii="Arial" w:hAnsi="Arial"/>
+          <w:rFonts w:ascii="B Nazanin" w:hAnsi="B Nazanin"/>
           <w:b/>
-          <w:color w:val="2C3E50"/>
-          <w:sz w:val="24"/>
+          <w:sz w:val="26"/>
         </w:rPr>
-        <w:t>Deep Learning Course — Assignment #1</w:t>
-        <w:br/>
-        <w:t>Regression for Gold Price Prediction (SPDR Gold Shares - GLD)</w:t>
+        <w:t>گزارش تمرین اول: پیش‌بینی قیمت طلا با مدل‌های رگرسیون خطی و ریج (Ridge)</w:t>
       </w:r>
     </w:p>
     <w:p>
       <w:pPr>
-        <w:spacing w:after="320"/>
+        <w:spacing w:after="240"/>
         <w:jc w:val="center"/>
       </w:pPr>
       <w:r>
         <w:rPr>
-          <w:rFonts w:ascii="Arial" w:hAnsi="Arial"/>
-          <w:i/>
-          <w:color w:val="555555"/>
-          <w:sz w:val="20"/>
+          <w:rFonts w:ascii="B Nazanin" w:hAnsi="B Nazanin"/>
+          <w:sz w:val="22"/>
         </w:rPr>
-        <w:t>Student: Matin Sojoudi (متین سجودی) | Student ID: 14014421025</w:t>
+        <w:t>نام دانشجو: متین سجودی | شماره دانشجویی: 14014421025</w:t>
         <w:br/>
-        <w:t>Instructor: Dr. Saleh Yousefi | Term: Autumn 2026</w:t>
+        <w:t>استاد درس: دکتر صالح یوسفی | پاییز ۱۴۰۵</w:t>
       </w:r>
     </w:p>
     <w:p>
@@ -58,114 +53,93 @@
         <w:jc w:val="center"/>
       </w:pPr>
       <w:r>
-        <w:t>———————————————————————————————————————————————————————</w:t>
+        <w:t>---------------------------------------------------------------------------------------------------------</w:t>
       </w:r>
     </w:p>
     <w:p>
       <w:pPr>
-        <w:pStyle w:val="Heading1"/>
-        <w:spacing w:before="240" w:after="80"/>
+        <w:spacing w:before="280" w:after="80"/>
       </w:pPr>
       <w:r>
         <w:rPr>
-          <w:rFonts w:ascii="Arial" w:hAnsi="Arial"/>
-          <w:color w:val="1A365D"/>
+          <w:rFonts w:ascii="B Nazanin" w:hAnsi="B Nazanin"/>
+          <w:b/>
+          <w:color w:val="003366"/>
+          <w:sz w:val="24"/>
         </w:rPr>
-        <w:t>1. Objective</w:t>
+        <w:t>۱. مقدمه و صورت مسئله</w:t>
       </w:r>
     </w:p>
     <w:p>
       <w:pPr>
-        <w:spacing w:line="276" w:lineRule="auto"/>
+        <w:spacing w:line="288" w:lineRule="auto"/>
       </w:pPr>
       <w:r>
-        <w:t>The primary goal of this assignment is to develop, evaluate, and benchmark two classical supervised machine learning regression techniques—Ordinary Least Squares (Linear Regression) and L2-regularized Linear Regression (Ridge Regression)—to predict the next day's closing price of gold based on daily market parameters. Through this empirical study, we evaluate the models' predictive accuracy, generalizability, and robustness against market volatility.</w:t>
+        <w:rPr>
+          <w:rFonts w:ascii="B Nazanin" w:hAnsi="B Nazanin"/>
+          <w:sz w:val="23"/>
+        </w:rPr>
+        <w:t>در این تمرین، هدف پیش‌بینی قیمت پایانی (Close) روز بعد طلا با استفاده از ویژگی‌های معاملات روز جاری است. داده‌های استفاده شده مربوط به صندوق طلای SPDR (نماد GLD) در بازه زمانی سال‌های ۲۰۱۸ تا انتهای ۲۰۲۴ (حدود ۷ سال معامله روزانه) می‌باشد. برای مدلسازی، دو روش رگرسیون خطی معمولی (Linear Regression) و رگرسیون ریج با جریمه لایه دوم (Ridge Regression) پیاده‌سازی و عملکرد آنها با هم مقایسه شده است.</w:t>
       </w:r>
     </w:p>
     <w:p>
       <w:pPr>
-        <w:pStyle w:val="Heading1"/>
-        <w:spacing w:before="240" w:after="80"/>
+        <w:spacing w:before="280" w:after="80"/>
       </w:pPr>
       <w:r>
         <w:rPr>
-          <w:rFonts w:ascii="Arial" w:hAnsi="Arial"/>
-          <w:color w:val="1A365D"/>
+          <w:rFonts w:ascii="B Nazanin" w:hAnsi="B Nazanin"/>
+          <w:b/>
+          <w:color w:val="003366"/>
+          <w:sz w:val="24"/>
         </w:rPr>
-        <w:t>2. Dataset Description &amp; Preprocessing</w:t>
-      </w:r>
-    </w:p>
-    <w:p>
-      <w:r>
-        <w:t>The benchmark historical dataset corresponds to SPDR Gold Shares (Ticker: GLD), spanning a comprehensive 7-year period from January 2, 2018 to December 31, 2024. The original dataset consists of daily market activity attributes:</w:t>
-        <w:br/>
-        <w:t>• Open, High, Low, Close (in USD)</w:t>
-        <w:br/>
-        <w:t>• Trading Volume (number of shares traded daily)</w:t>
-        <w:br/>
-        <w:br/>
-        <w:t>Key Preprocessing Steps Executed:</w:t>
-        <w:br/>
-        <w:t>1. Time-series Alignment: Verified temporal ordering and sorted rows chronologically by trading date.</w:t>
-        <w:br/>
-        <w:t>2. Target Construction: Created the supervised label (Target_Next_Close) by shifting daily Close prices by -1 (t+1).</w:t>
-        <w:br/>
-        <w:t>3. Boundary Handling: Dropped the terminal record lacking the t+1 closing target, yielding 1,760 verified trading samples.</w:t>
-        <w:br/>
-        <w:t>4. Feature Normalization: Scaled the Volume attribute to millions of units to prevent numerical instability and scale distortion.</w:t>
-        <w:br/>
-        <w:t>5. Chronological Train/Test Partition: Applied an 80% / 20% sequential split without random shuffling to preserve temporal structure and prevent lookahead bias. The training set covers 1,408 days (2018-01-02 to 2023-08-07), and the test set covers 352 trading days (2023-08-08 to 2024-12-30).</w:t>
+        <w:t>۲. پیش‌پردازش داده‌ها و آماده‌سازی برای آموزش</w:t>
       </w:r>
     </w:p>
     <w:p>
       <w:pPr>
-        <w:pStyle w:val="Heading1"/>
-        <w:spacing w:before="240" w:after="80"/>
+        <w:spacing w:line="288" w:lineRule="auto"/>
       </w:pPr>
       <w:r>
         <w:rPr>
-          <w:rFonts w:ascii="Arial" w:hAnsi="Arial"/>
-          <w:color w:val="1A365D"/>
+          <w:rFonts w:ascii="B Nazanin" w:hAnsi="B Nazanin"/>
+          <w:sz w:val="23"/>
         </w:rPr>
-        <w:t>3. Model Architecture &amp; Theoretical Foundation</w:t>
-      </w:r>
-    </w:p>
-    <w:p>
-      <w:r>
-        <w:t>• Linear Regression (OLS): Minimizes the sum of squared differences between observed and predicted targets without penalty:</w:t>
+        <w:t>مراحل آماده‌سازی داده‌ها به شرح زیر انجام شد:</w:t>
         <w:br/>
-        <w:t xml:space="preserve">    Loss_OLS(w) = || y - Xw ||²</w:t>
+        <w:t>۱. مرتب‌سازی زمانی: ابتدا فایل داده‌های GLD بر اساس ستون تاریخ مرتب شد تا ترتیبات زمانی داده‌ها حفظ شود.</w:t>
         <w:br/>
+        <w:t>۲. ساخت متغیر هدف: قیمت Close با یک گام شیفت زمانی به عقب (shift(-1)) به عنوان قیمت روز بعد (Next_Close) تعریف شد. سطر آخر به دلیل خالی بودن مقدار روز بعد از مجموعه حذف گردید که در نهایت ۱۷۶۰ سطر معتبر باقی ماند.</w:t>
         <w:br/>
-        <w:t>• Ridge Regression: Implements L2-norm weight shrinkage (Tikhonov regularization) with hyperparameter alpha = 1.0:</w:t>
+        <w:t>۳. مقیاس‌بندی ویژگی حجم: ستون Volume به دلیل مقادیر عددی بزرگ (میلیونی) به مقیاس میلیون واحد تبدیل شد تا از خطاهای سرریز محاسباتی جلوگیری شود.</w:t>
         <w:br/>
-        <w:t xml:space="preserve">    Loss_Ridge(w) = || y - Xw ||² + alpha * || w ||²</w:t>
-        <w:br/>
-        <w:t>This regularization penalizes large regression coefficients, mitigating potential collinearity between daily High, Low, and Close features.</w:t>
+        <w:t>۴. تقسیم به دو بخش آموزش و آزمایش: برای رعایت ماهیت سری‌های زمانی، داده‌ها بدون جابجایی تصادفی (بدون Shuffle) به نسبت ۸۰ درصد داده‌های اولیه برای آموزش (۱۴۰۸ نمونه از اوایل ۲۰۱۸ تا مرداد ۱۴۰۲) و ۲۰ درصد انتهایی برای آزمایش (۳۵۲ نمونه از مرداد ۱۴۰۲ تا پایان ۲۰۲۴) تقسیم شدند.</w:t>
       </w:r>
     </w:p>
     <w:p>
       <w:pPr>
-        <w:pStyle w:val="Heading1"/>
-        <w:spacing w:before="240" w:after="80"/>
+        <w:spacing w:before="280" w:after="80"/>
       </w:pPr>
       <w:r>
         <w:rPr>
-          <w:rFonts w:ascii="Arial" w:hAnsi="Arial"/>
-          <w:color w:val="1A365D"/>
+          <w:rFonts w:ascii="B Nazanin" w:hAnsi="B Nazanin"/>
+          <w:b/>
+          <w:color w:val="003366"/>
+          <w:sz w:val="24"/>
         </w:rPr>
-        <w:t>4. Quantitative Evaluation &amp; Comparative Performance</w:t>
+        <w:t>۳. آموزش مدل‌ها و معیارهای ارزیابی</w:t>
       </w:r>
     </w:p>
     <w:p>
+      <w:pPr>
+        <w:spacing w:line="288" w:lineRule="auto"/>
+      </w:pPr>
       <w:r>
-        <w:t>Both models were tested on the identical out-of-sample test partition (352 trading days). Performance was evaluated using:</w:t>
-        <w:br/>
-        <w:t>• Mean Absolute Error (MAE): Measures average prediction deviation in dollars.</w:t>
-        <w:br/>
-        <w:t>• Root Mean Squared Error (RMSE): Penalizes larger prediction anomalies.</w:t>
-        <w:br/>
-        <w:t>• Coefficient of Determination (R²): Quantifies the proportion of explained variance.</w:t>
+        <w:rPr>
+          <w:rFonts w:ascii="B Nazanin" w:hAnsi="B Nazanin"/>
+          <w:sz w:val="23"/>
+        </w:rPr>
+        <w:t>هر دو مدل با کتابخانه scikit-learn روی مجموعه آموزش برازش داده شدند و سپس قیمت‌های روز بعد برای داده‌های تست پیش‌بینی شد. معیارهای محاسبه‌شده شامل میانگین قدرمطلق خطا (MAE)، ریشه میانگین مربعات خطا (RMSE) و ضریب تعیین (R2) هستند:</w:t>
       </w:r>
     </w:p>
     <w:tbl>
@@ -184,12 +158,12 @@
         <w:tc>
           <w:tcPr>
             <w:tcW w:type="dxa" w:w="2340"/>
-            <w:shd w:fill="1A365D"/>
+            <w:shd w:fill="E2E8F0"/>
             <w:tcMar>
-              <w:top w:w="140" w:type="dxa"/>
-              <w:bottom w:w="140" w:type="dxa"/>
-              <w:left w:w="150" w:type="dxa"/>
-              <w:right w:w="150" w:type="dxa"/>
+              <w:top w:w="100" w:type="dxa"/>
+              <w:bottom w:w="100" w:type="dxa"/>
+              <w:left w:w="120" w:type="dxa"/>
+              <w:right w:w="120" w:type="dxa"/>
             </w:tcMar>
           </w:tcPr>
           <w:p>
@@ -198,24 +172,23 @@
             </w:pPr>
             <w:r>
               <w:rPr>
-                <w:rFonts w:ascii="Arial" w:hAnsi="Arial"/>
+                <w:rFonts w:ascii="B Nazanin" w:hAnsi="B Nazanin"/>
                 <w:b/>
-                <w:color w:val="FFFFFF"/>
-                <w:sz w:val="20"/>
+                <w:sz w:val="21"/>
               </w:rPr>
-              <w:t>Model</w:t>
+              <w:t>مدل رگرسیون</w:t>
             </w:r>
           </w:p>
         </w:tc>
         <w:tc>
           <w:tcPr>
             <w:tcW w:type="dxa" w:w="2340"/>
-            <w:shd w:fill="1A365D"/>
+            <w:shd w:fill="E2E8F0"/>
             <w:tcMar>
-              <w:top w:w="140" w:type="dxa"/>
-              <w:bottom w:w="140" w:type="dxa"/>
-              <w:left w:w="150" w:type="dxa"/>
-              <w:right w:w="150" w:type="dxa"/>
+              <w:top w:w="100" w:type="dxa"/>
+              <w:bottom w:w="100" w:type="dxa"/>
+              <w:left w:w="120" w:type="dxa"/>
+              <w:right w:w="120" w:type="dxa"/>
             </w:tcMar>
           </w:tcPr>
           <w:p>
@@ -224,24 +197,23 @@
             </w:pPr>
             <w:r>
               <w:rPr>
-                <w:rFonts w:ascii="Arial" w:hAnsi="Arial"/>
+                <w:rFonts w:ascii="B Nazanin" w:hAnsi="B Nazanin"/>
                 <w:b/>
-                <w:color w:val="FFFFFF"/>
-                <w:sz w:val="20"/>
+                <w:sz w:val="21"/>
               </w:rPr>
-              <w:t>MAE (USD)</w:t>
+              <w:t>MAE (دلار)</w:t>
             </w:r>
           </w:p>
         </w:tc>
         <w:tc>
           <w:tcPr>
             <w:tcW w:type="dxa" w:w="2340"/>
-            <w:shd w:fill="1A365D"/>
+            <w:shd w:fill="E2E8F0"/>
             <w:tcMar>
-              <w:top w:w="140" w:type="dxa"/>
-              <w:bottom w:w="140" w:type="dxa"/>
-              <w:left w:w="150" w:type="dxa"/>
-              <w:right w:w="150" w:type="dxa"/>
+              <w:top w:w="100" w:type="dxa"/>
+              <w:bottom w:w="100" w:type="dxa"/>
+              <w:left w:w="120" w:type="dxa"/>
+              <w:right w:w="120" w:type="dxa"/>
             </w:tcMar>
           </w:tcPr>
           <w:p>
@@ -250,24 +222,23 @@
             </w:pPr>
             <w:r>
               <w:rPr>
-                <w:rFonts w:ascii="Arial" w:hAnsi="Arial"/>
+                <w:rFonts w:ascii="B Nazanin" w:hAnsi="B Nazanin"/>
                 <w:b/>
-                <w:color w:val="FFFFFF"/>
-                <w:sz w:val="20"/>
+                <w:sz w:val="21"/>
               </w:rPr>
-              <w:t>RMSE (USD)</w:t>
+              <w:t>RMSE (دلار)</w:t>
             </w:r>
           </w:p>
         </w:tc>
         <w:tc>
           <w:tcPr>
             <w:tcW w:type="dxa" w:w="2340"/>
-            <w:shd w:fill="1A365D"/>
+            <w:shd w:fill="E2E8F0"/>
             <w:tcMar>
-              <w:top w:w="140" w:type="dxa"/>
-              <w:bottom w:w="140" w:type="dxa"/>
-              <w:left w:w="150" w:type="dxa"/>
-              <w:right w:w="150" w:type="dxa"/>
+              <w:top w:w="100" w:type="dxa"/>
+              <w:bottom w:w="100" w:type="dxa"/>
+              <w:left w:w="120" w:type="dxa"/>
+              <w:right w:w="120" w:type="dxa"/>
             </w:tcMar>
           </w:tcPr>
           <w:p>
@@ -276,12 +247,11 @@
             </w:pPr>
             <w:r>
               <w:rPr>
-                <w:rFonts w:ascii="Arial" w:hAnsi="Arial"/>
+                <w:rFonts w:ascii="B Nazanin" w:hAnsi="B Nazanin"/>
                 <w:b/>
-                <w:color w:val="FFFFFF"/>
-                <w:sz w:val="20"/>
+                <w:sz w:val="21"/>
               </w:rPr>
-              <w:t>R² Score</w:t>
+              <w:t>ضریب تعیین (R²)</w:t>
             </w:r>
           </w:p>
         </w:tc>
@@ -292,10 +262,34 @@
             <w:tcW w:type="dxa" w:w="2340"/>
             <w:shd w:fill="FFFFFF"/>
             <w:tcMar>
-              <w:top w:w="100" w:type="dxa"/>
-              <w:bottom w:w="100" w:type="dxa"/>
-              <w:left w:w="150" w:type="dxa"/>
-              <w:right w:w="150" w:type="dxa"/>
+              <w:top w:w="80" w:type="dxa"/>
+              <w:bottom w:w="80" w:type="dxa"/>
+              <w:left w:w="120" w:type="dxa"/>
+              <w:right w:w="120" w:type="dxa"/>
+            </w:tcMar>
+          </w:tcPr>
+          <w:p>
+            <w:pPr>
+              <w:jc w:val="center"/>
+            </w:pPr>
+            <w:r>
+              <w:rPr>
+                <w:rFonts w:ascii="B Nazanin" w:hAnsi="B Nazanin"/>
+                <w:sz w:val="20"/>
+              </w:rPr>
+              <w:t>Linear Regression</w:t>
+            </w:r>
+          </w:p>
+        </w:tc>
+        <w:tc>
+          <w:tcPr>
+            <w:tcW w:type="dxa" w:w="2340"/>
+            <w:shd w:fill="FFFFFF"/>
+            <w:tcMar>
+              <w:top w:w="80" w:type="dxa"/>
+              <w:bottom w:w="80" w:type="dxa"/>
+              <w:left w:w="120" w:type="dxa"/>
+              <w:right w:w="120" w:type="dxa"/>
             </w:tcMar>
           </w:tcPr>
           <w:p>
@@ -305,31 +299,7 @@
             <w:r>
               <w:rPr>
                 <w:rFonts w:ascii="Arial" w:hAnsi="Arial"/>
-                <w:sz w:val="19"/>
-              </w:rPr>
-              <w:t>Linear Regression (OLS)</w:t>
-            </w:r>
-          </w:p>
-        </w:tc>
-        <w:tc>
-          <w:tcPr>
-            <w:tcW w:type="dxa" w:w="2340"/>
-            <w:shd w:fill="FFFFFF"/>
-            <w:tcMar>
-              <w:top w:w="100" w:type="dxa"/>
-              <w:bottom w:w="100" w:type="dxa"/>
-              <w:left w:w="150" w:type="dxa"/>
-              <w:right w:w="150" w:type="dxa"/>
-            </w:tcMar>
-          </w:tcPr>
-          <w:p>
-            <w:pPr>
-              <w:jc w:val="center"/>
-            </w:pPr>
-            <w:r>
-              <w:rPr>
-                <w:rFonts w:ascii="Arial" w:hAnsi="Arial"/>
-                <w:sz w:val="19"/>
+                <w:sz w:val="20"/>
               </w:rPr>
               <w:t>1.4745</w:t>
             </w:r>
@@ -340,10 +310,10 @@
             <w:tcW w:type="dxa" w:w="2340"/>
             <w:shd w:fill="FFFFFF"/>
             <w:tcMar>
-              <w:top w:w="100" w:type="dxa"/>
-              <w:bottom w:w="100" w:type="dxa"/>
-              <w:left w:w="150" w:type="dxa"/>
-              <w:right w:w="150" w:type="dxa"/>
+              <w:top w:w="80" w:type="dxa"/>
+              <w:bottom w:w="80" w:type="dxa"/>
+              <w:left w:w="120" w:type="dxa"/>
+              <w:right w:w="120" w:type="dxa"/>
             </w:tcMar>
           </w:tcPr>
           <w:p>
@@ -353,7 +323,7 @@
             <w:r>
               <w:rPr>
                 <w:rFonts w:ascii="Arial" w:hAnsi="Arial"/>
-                <w:sz w:val="19"/>
+                <w:sz w:val="20"/>
               </w:rPr>
               <w:t>1.9759</w:t>
             </w:r>
@@ -364,10 +334,10 @@
             <w:tcW w:type="dxa" w:w="2340"/>
             <w:shd w:fill="FFFFFF"/>
             <w:tcMar>
-              <w:top w:w="100" w:type="dxa"/>
-              <w:bottom w:w="100" w:type="dxa"/>
-              <w:left w:w="150" w:type="dxa"/>
-              <w:right w:w="150" w:type="dxa"/>
+              <w:top w:w="80" w:type="dxa"/>
+              <w:bottom w:w="80" w:type="dxa"/>
+              <w:left w:w="120" w:type="dxa"/>
+              <w:right w:w="120" w:type="dxa"/>
             </w:tcMar>
           </w:tcPr>
           <w:p>
@@ -377,7 +347,7 @@
             <w:r>
               <w:rPr>
                 <w:rFonts w:ascii="Arial" w:hAnsi="Arial"/>
-                <w:sz w:val="19"/>
+                <w:sz w:val="20"/>
               </w:rPr>
               <w:t>0.9938</w:t>
             </w:r>
@@ -388,12 +358,36 @@
         <w:tc>
           <w:tcPr>
             <w:tcW w:type="dxa" w:w="2340"/>
-            <w:shd w:fill="F7FAFC"/>
+            <w:shd w:fill="F8FAFC"/>
             <w:tcMar>
-              <w:top w:w="100" w:type="dxa"/>
-              <w:bottom w:w="100" w:type="dxa"/>
-              <w:left w:w="150" w:type="dxa"/>
-              <w:right w:w="150" w:type="dxa"/>
+              <w:top w:w="80" w:type="dxa"/>
+              <w:bottom w:w="80" w:type="dxa"/>
+              <w:left w:w="120" w:type="dxa"/>
+              <w:right w:w="120" w:type="dxa"/>
+            </w:tcMar>
+          </w:tcPr>
+          <w:p>
+            <w:pPr>
+              <w:jc w:val="center"/>
+            </w:pPr>
+            <w:r>
+              <w:rPr>
+                <w:rFonts w:ascii="B Nazanin" w:hAnsi="B Nazanin"/>
+                <w:sz w:val="20"/>
+              </w:rPr>
+              <w:t>Ridge Regression (alpha=1.0)</w:t>
+            </w:r>
+          </w:p>
+        </w:tc>
+        <w:tc>
+          <w:tcPr>
+            <w:tcW w:type="dxa" w:w="2340"/>
+            <w:shd w:fill="F8FAFC"/>
+            <w:tcMar>
+              <w:top w:w="80" w:type="dxa"/>
+              <w:bottom w:w="80" w:type="dxa"/>
+              <w:left w:w="120" w:type="dxa"/>
+              <w:right w:w="120" w:type="dxa"/>
             </w:tcMar>
           </w:tcPr>
           <w:p>
@@ -403,21 +397,21 @@
             <w:r>
               <w:rPr>
                 <w:rFonts w:ascii="Arial" w:hAnsi="Arial"/>
-                <w:sz w:val="19"/>
+                <w:sz w:val="20"/>
               </w:rPr>
-              <w:t>Ridge Regression (alpha=1.0)</w:t>
+              <w:t>1.4745</w:t>
             </w:r>
           </w:p>
         </w:tc>
         <w:tc>
           <w:tcPr>
             <w:tcW w:type="dxa" w:w="2340"/>
-            <w:shd w:fill="F7FAFC"/>
+            <w:shd w:fill="F8FAFC"/>
             <w:tcMar>
-              <w:top w:w="100" w:type="dxa"/>
-              <w:bottom w:w="100" w:type="dxa"/>
-              <w:left w:w="150" w:type="dxa"/>
-              <w:right w:w="150" w:type="dxa"/>
+              <w:top w:w="80" w:type="dxa"/>
+              <w:bottom w:w="80" w:type="dxa"/>
+              <w:left w:w="120" w:type="dxa"/>
+              <w:right w:w="120" w:type="dxa"/>
             </w:tcMar>
           </w:tcPr>
           <w:p>
@@ -427,21 +421,21 @@
             <w:r>
               <w:rPr>
                 <w:rFonts w:ascii="Arial" w:hAnsi="Arial"/>
-                <w:sz w:val="19"/>
+                <w:sz w:val="20"/>
               </w:rPr>
-              <w:t>1.4745</w:t>
+              <w:t>1.9757</w:t>
             </w:r>
           </w:p>
         </w:tc>
         <w:tc>
           <w:tcPr>
             <w:tcW w:type="dxa" w:w="2340"/>
-            <w:shd w:fill="F7FAFC"/>
+            <w:shd w:fill="F8FAFC"/>
             <w:tcMar>
-              <w:top w:w="100" w:type="dxa"/>
-              <w:bottom w:w="100" w:type="dxa"/>
-              <w:left w:w="150" w:type="dxa"/>
-              <w:right w:w="150" w:type="dxa"/>
+              <w:top w:w="80" w:type="dxa"/>
+              <w:bottom w:w="80" w:type="dxa"/>
+              <w:left w:w="120" w:type="dxa"/>
+              <w:right w:w="120" w:type="dxa"/>
             </w:tcMar>
           </w:tcPr>
           <w:p>
@@ -451,31 +445,7 @@
             <w:r>
               <w:rPr>
                 <w:rFonts w:ascii="Arial" w:hAnsi="Arial"/>
-                <w:sz w:val="19"/>
-              </w:rPr>
-              <w:t>1.9757</w:t>
-            </w:r>
-          </w:p>
-        </w:tc>
-        <w:tc>
-          <w:tcPr>
-            <w:tcW w:type="dxa" w:w="2340"/>
-            <w:shd w:fill="F7FAFC"/>
-            <w:tcMar>
-              <w:top w:w="100" w:type="dxa"/>
-              <w:bottom w:w="100" w:type="dxa"/>
-              <w:left w:w="150" w:type="dxa"/>
-              <w:right w:w="150" w:type="dxa"/>
-            </w:tcMar>
-          </w:tcPr>
-          <w:p>
-            <w:pPr>
-              <w:jc w:val="center"/>
-            </w:pPr>
-            <w:r>
-              <w:rPr>
-                <w:rFonts w:ascii="Arial" w:hAnsi="Arial"/>
-                <w:sz w:val="19"/>
+                <w:sz w:val="20"/>
               </w:rPr>
               <w:t>0.9938</w:t>
             </w:r>
@@ -485,12 +455,16 @@
     </w:tbl>
     <w:p>
       <w:pPr>
-        <w:spacing w:after="160"/>
+        <w:spacing w:after="120"/>
       </w:pPr>
     </w:p>
     <w:p>
       <w:r>
-        <w:t>Table 2: Representative Predictions vs. Ground Truth on the Test Set:</w:t>
+        <w:rPr>
+          <w:rFonts w:ascii="B Nazanin" w:hAnsi="B Nazanin"/>
+          <w:sz w:val="21"/>
+        </w:rPr>
+        <w:t>جدول ۲: مقایسه نمونه‌ای از قیمت واقعی روز بعد با پیش‌بینی دو مدل روی داده‌های تست:</w:t>
       </w:r>
     </w:p>
     <w:tbl>
@@ -509,12 +483,12 @@
         <w:tc>
           <w:tcPr>
             <w:tcW w:type="dxa" w:w="2340"/>
-            <w:shd w:fill="2C3E50"/>
+            <w:shd w:fill="E2E8F0"/>
             <w:tcMar>
-              <w:top w:w="120" w:type="dxa"/>
-              <w:bottom w:w="120" w:type="dxa"/>
-              <w:left w:w="150" w:type="dxa"/>
-              <w:right w:w="150" w:type="dxa"/>
+              <w:top w:w="80" w:type="dxa"/>
+              <w:bottom w:w="80" w:type="dxa"/>
+              <w:left w:w="120" w:type="dxa"/>
+              <w:right w:w="120" w:type="dxa"/>
             </w:tcMar>
           </w:tcPr>
           <w:p>
@@ -523,24 +497,23 @@
             </w:pPr>
             <w:r>
               <w:rPr>
-                <w:rFonts w:ascii="Arial" w:hAnsi="Arial"/>
+                <w:rFonts w:ascii="B Nazanin" w:hAnsi="B Nazanin"/>
                 <w:b/>
-                <w:color w:val="FFFFFF"/>
-                <w:sz w:val="19"/>
+                <w:sz w:val="20"/>
               </w:rPr>
-              <w:t>Date</w:t>
+              <w:t>تاریخ</w:t>
             </w:r>
           </w:p>
         </w:tc>
         <w:tc>
           <w:tcPr>
             <w:tcW w:type="dxa" w:w="2340"/>
-            <w:shd w:fill="2C3E50"/>
+            <w:shd w:fill="E2E8F0"/>
             <w:tcMar>
-              <w:top w:w="120" w:type="dxa"/>
-              <w:bottom w:w="120" w:type="dxa"/>
-              <w:left w:w="150" w:type="dxa"/>
-              <w:right w:w="150" w:type="dxa"/>
+              <w:top w:w="80" w:type="dxa"/>
+              <w:bottom w:w="80" w:type="dxa"/>
+              <w:left w:w="120" w:type="dxa"/>
+              <w:right w:w="120" w:type="dxa"/>
             </w:tcMar>
           </w:tcPr>
           <w:p>
@@ -549,24 +522,23 @@
             </w:pPr>
             <w:r>
               <w:rPr>
-                <w:rFonts w:ascii="Arial" w:hAnsi="Arial"/>
+                <w:rFonts w:ascii="B Nazanin" w:hAnsi="B Nazanin"/>
                 <w:b/>
-                <w:color w:val="FFFFFF"/>
-                <w:sz w:val="19"/>
+                <w:sz w:val="20"/>
               </w:rPr>
-              <w:t>Actual Close (USD)</w:t>
+              <w:t>قیمت واقعی (دلار)</w:t>
             </w:r>
           </w:p>
         </w:tc>
         <w:tc>
           <w:tcPr>
             <w:tcW w:type="dxa" w:w="2340"/>
-            <w:shd w:fill="2C3E50"/>
+            <w:shd w:fill="E2E8F0"/>
             <w:tcMar>
-              <w:top w:w="120" w:type="dxa"/>
-              <w:bottom w:w="120" w:type="dxa"/>
-              <w:left w:w="150" w:type="dxa"/>
-              <w:right w:w="150" w:type="dxa"/>
+              <w:top w:w="80" w:type="dxa"/>
+              <w:bottom w:w="80" w:type="dxa"/>
+              <w:left w:w="120" w:type="dxa"/>
+              <w:right w:w="120" w:type="dxa"/>
             </w:tcMar>
           </w:tcPr>
           <w:p>
@@ -575,24 +547,23 @@
             </w:pPr>
             <w:r>
               <w:rPr>
-                <w:rFonts w:ascii="Arial" w:hAnsi="Arial"/>
+                <w:rFonts w:ascii="B Nazanin" w:hAnsi="B Nazanin"/>
                 <w:b/>
-                <w:color w:val="FFFFFF"/>
-                <w:sz w:val="19"/>
+                <w:sz w:val="20"/>
               </w:rPr>
-              <w:t>LR Predicted (USD)</w:t>
+              <w:t>پیش‌بینی Linear</w:t>
             </w:r>
           </w:p>
         </w:tc>
         <w:tc>
           <w:tcPr>
             <w:tcW w:type="dxa" w:w="2340"/>
-            <w:shd w:fill="2C3E50"/>
+            <w:shd w:fill="E2E8F0"/>
             <w:tcMar>
-              <w:top w:w="120" w:type="dxa"/>
-              <w:bottom w:w="120" w:type="dxa"/>
-              <w:left w:w="150" w:type="dxa"/>
-              <w:right w:w="150" w:type="dxa"/>
+              <w:top w:w="80" w:type="dxa"/>
+              <w:bottom w:w="80" w:type="dxa"/>
+              <w:left w:w="120" w:type="dxa"/>
+              <w:right w:w="120" w:type="dxa"/>
             </w:tcMar>
           </w:tcPr>
           <w:p>
@@ -601,12 +572,11 @@
             </w:pPr>
             <w:r>
               <w:rPr>
-                <w:rFonts w:ascii="Arial" w:hAnsi="Arial"/>
+                <w:rFonts w:ascii="B Nazanin" w:hAnsi="B Nazanin"/>
                 <w:b/>
-                <w:color w:val="FFFFFF"/>
-                <w:sz w:val="19"/>
+                <w:sz w:val="20"/>
               </w:rPr>
-              <w:t>Ridge Predicted (USD)</w:t>
+              <w:t>پیش‌بینی Ridge</w:t>
             </w:r>
           </w:p>
         </w:tc>
@@ -617,10 +587,10 @@
             <w:tcW w:type="dxa" w:w="2340"/>
             <w:shd w:fill="FFFFFF"/>
             <w:tcMar>
-              <w:top w:w="80" w:type="dxa"/>
-              <w:bottom w:w="80" w:type="dxa"/>
-              <w:left w:w="150" w:type="dxa"/>
-              <w:right w:w="150" w:type="dxa"/>
+              <w:top w:w="60" w:type="dxa"/>
+              <w:bottom w:w="60" w:type="dxa"/>
+              <w:left w:w="120" w:type="dxa"/>
+              <w:right w:w="120" w:type="dxa"/>
             </w:tcMar>
           </w:tcPr>
           <w:p>
@@ -630,7 +600,7 @@
             <w:r>
               <w:rPr>
                 <w:rFonts w:ascii="Arial" w:hAnsi="Arial"/>
-                <w:sz w:val="18"/>
+                <w:sz w:val="19"/>
               </w:rPr>
               <w:t>2024-12-16</w:t>
             </w:r>
@@ -641,10 +611,10 @@
             <w:tcW w:type="dxa" w:w="2340"/>
             <w:shd w:fill="FFFFFF"/>
             <w:tcMar>
-              <w:top w:w="80" w:type="dxa"/>
-              <w:bottom w:w="80" w:type="dxa"/>
-              <w:left w:w="150" w:type="dxa"/>
-              <w:right w:w="150" w:type="dxa"/>
+              <w:top w:w="60" w:type="dxa"/>
+              <w:bottom w:w="60" w:type="dxa"/>
+              <w:left w:w="120" w:type="dxa"/>
+              <w:right w:w="120" w:type="dxa"/>
             </w:tcMar>
           </w:tcPr>
           <w:p>
@@ -654,7 +624,7 @@
             <w:r>
               <w:rPr>
                 <w:rFonts w:ascii="Arial" w:hAnsi="Arial"/>
-                <w:sz w:val="18"/>
+                <w:sz w:val="19"/>
               </w:rPr>
               <w:t>243.94</w:t>
             </w:r>
@@ -665,10 +635,10 @@
             <w:tcW w:type="dxa" w:w="2340"/>
             <w:shd w:fill="FFFFFF"/>
             <w:tcMar>
-              <w:top w:w="80" w:type="dxa"/>
-              <w:bottom w:w="80" w:type="dxa"/>
-              <w:left w:w="150" w:type="dxa"/>
-              <w:right w:w="150" w:type="dxa"/>
+              <w:top w:w="60" w:type="dxa"/>
+              <w:bottom w:w="60" w:type="dxa"/>
+              <w:left w:w="120" w:type="dxa"/>
+              <w:right w:w="120" w:type="dxa"/>
             </w:tcMar>
           </w:tcPr>
           <w:p>
@@ -678,7 +648,7 @@
             <w:r>
               <w:rPr>
                 <w:rFonts w:ascii="Arial" w:hAnsi="Arial"/>
-                <w:sz w:val="18"/>
+                <w:sz w:val="19"/>
               </w:rPr>
               <w:t>244.80</w:t>
             </w:r>
@@ -689,10 +659,10 @@
             <w:tcW w:type="dxa" w:w="2340"/>
             <w:shd w:fill="FFFFFF"/>
             <w:tcMar>
-              <w:top w:w="80" w:type="dxa"/>
-              <w:bottom w:w="80" w:type="dxa"/>
-              <w:left w:w="150" w:type="dxa"/>
-              <w:right w:w="150" w:type="dxa"/>
+              <w:top w:w="60" w:type="dxa"/>
+              <w:bottom w:w="60" w:type="dxa"/>
+              <w:left w:w="120" w:type="dxa"/>
+              <w:right w:w="120" w:type="dxa"/>
             </w:tcMar>
           </w:tcPr>
           <w:p>
@@ -702,7 +672,7 @@
             <w:r>
               <w:rPr>
                 <w:rFonts w:ascii="Arial" w:hAnsi="Arial"/>
-                <w:sz w:val="18"/>
+                <w:sz w:val="19"/>
               </w:rPr>
               <w:t>244.80</w:t>
             </w:r>
@@ -713,12 +683,12 @@
         <w:tc>
           <w:tcPr>
             <w:tcW w:type="dxa" w:w="2340"/>
-            <w:shd w:fill="F8F9FA"/>
+            <w:shd w:fill="F8FAFC"/>
             <w:tcMar>
-              <w:top w:w="80" w:type="dxa"/>
-              <w:bottom w:w="80" w:type="dxa"/>
-              <w:left w:w="150" w:type="dxa"/>
-              <w:right w:w="150" w:type="dxa"/>
+              <w:top w:w="60" w:type="dxa"/>
+              <w:bottom w:w="60" w:type="dxa"/>
+              <w:left w:w="120" w:type="dxa"/>
+              <w:right w:w="120" w:type="dxa"/>
             </w:tcMar>
           </w:tcPr>
           <w:p>
@@ -728,7 +698,7 @@
             <w:r>
               <w:rPr>
                 <w:rFonts w:ascii="Arial" w:hAnsi="Arial"/>
-                <w:sz w:val="18"/>
+                <w:sz w:val="19"/>
               </w:rPr>
               <w:t>2024-12-17</w:t>
             </w:r>
@@ -737,12 +707,12 @@
         <w:tc>
           <w:tcPr>
             <w:tcW w:type="dxa" w:w="2340"/>
-            <w:shd w:fill="F8F9FA"/>
+            <w:shd w:fill="F8FAFC"/>
             <w:tcMar>
-              <w:top w:w="80" w:type="dxa"/>
-              <w:bottom w:w="80" w:type="dxa"/>
-              <w:left w:w="150" w:type="dxa"/>
-              <w:right w:w="150" w:type="dxa"/>
+              <w:top w:w="60" w:type="dxa"/>
+              <w:bottom w:w="60" w:type="dxa"/>
+              <w:left w:w="120" w:type="dxa"/>
+              <w:right w:w="120" w:type="dxa"/>
             </w:tcMar>
           </w:tcPr>
           <w:p>
@@ -752,7 +722,7 @@
             <w:r>
               <w:rPr>
                 <w:rFonts w:ascii="Arial" w:hAnsi="Arial"/>
-                <w:sz w:val="18"/>
+                <w:sz w:val="19"/>
               </w:rPr>
               <w:t>239.26</w:t>
             </w:r>
@@ -761,12 +731,12 @@
         <w:tc>
           <w:tcPr>
             <w:tcW w:type="dxa" w:w="2340"/>
-            <w:shd w:fill="F8F9FA"/>
+            <w:shd w:fill="F8FAFC"/>
             <w:tcMar>
-              <w:top w:w="80" w:type="dxa"/>
-              <w:bottom w:w="80" w:type="dxa"/>
-              <w:left w:w="150" w:type="dxa"/>
-              <w:right w:w="150" w:type="dxa"/>
+              <w:top w:w="60" w:type="dxa"/>
+              <w:bottom w:w="60" w:type="dxa"/>
+              <w:left w:w="120" w:type="dxa"/>
+              <w:right w:w="120" w:type="dxa"/>
             </w:tcMar>
           </w:tcPr>
           <w:p>
@@ -776,7 +746,7 @@
             <w:r>
               <w:rPr>
                 <w:rFonts w:ascii="Arial" w:hAnsi="Arial"/>
-                <w:sz w:val="18"/>
+                <w:sz w:val="19"/>
               </w:rPr>
               <w:t>243.87</w:t>
             </w:r>
@@ -785,12 +755,12 @@
         <w:tc>
           <w:tcPr>
             <w:tcW w:type="dxa" w:w="2340"/>
-            <w:shd w:fill="F8F9FA"/>
+            <w:shd w:fill="F8FAFC"/>
             <w:tcMar>
-              <w:top w:w="80" w:type="dxa"/>
-              <w:bottom w:w="80" w:type="dxa"/>
-              <w:left w:w="150" w:type="dxa"/>
-              <w:right w:w="150" w:type="dxa"/>
+              <w:top w:w="60" w:type="dxa"/>
+              <w:bottom w:w="60" w:type="dxa"/>
+              <w:left w:w="120" w:type="dxa"/>
+              <w:right w:w="120" w:type="dxa"/>
             </w:tcMar>
           </w:tcPr>
           <w:p>
@@ -800,7 +770,7 @@
             <w:r>
               <w:rPr>
                 <w:rFonts w:ascii="Arial" w:hAnsi="Arial"/>
-                <w:sz w:val="18"/>
+                <w:sz w:val="19"/>
               </w:rPr>
               <w:t>243.87</w:t>
             </w:r>
@@ -813,10 +783,10 @@
             <w:tcW w:type="dxa" w:w="2340"/>
             <w:shd w:fill="FFFFFF"/>
             <w:tcMar>
-              <w:top w:w="80" w:type="dxa"/>
-              <w:bottom w:w="80" w:type="dxa"/>
-              <w:left w:w="150" w:type="dxa"/>
-              <w:right w:w="150" w:type="dxa"/>
+              <w:top w:w="60" w:type="dxa"/>
+              <w:bottom w:w="60" w:type="dxa"/>
+              <w:left w:w="120" w:type="dxa"/>
+              <w:right w:w="120" w:type="dxa"/>
             </w:tcMar>
           </w:tcPr>
           <w:p>
@@ -826,7 +796,7 @@
             <w:r>
               <w:rPr>
                 <w:rFonts w:ascii="Arial" w:hAnsi="Arial"/>
-                <w:sz w:val="18"/>
+                <w:sz w:val="19"/>
               </w:rPr>
               <w:t>2024-12-18</w:t>
             </w:r>
@@ -837,10 +807,10 @@
             <w:tcW w:type="dxa" w:w="2340"/>
             <w:shd w:fill="FFFFFF"/>
             <w:tcMar>
-              <w:top w:w="80" w:type="dxa"/>
-              <w:bottom w:w="80" w:type="dxa"/>
-              <w:left w:w="150" w:type="dxa"/>
-              <w:right w:w="150" w:type="dxa"/>
+              <w:top w:w="60" w:type="dxa"/>
+              <w:bottom w:w="60" w:type="dxa"/>
+              <w:left w:w="120" w:type="dxa"/>
+              <w:right w:w="120" w:type="dxa"/>
             </w:tcMar>
           </w:tcPr>
           <w:p>
@@ -850,7 +820,7 @@
             <w:r>
               <w:rPr>
                 <w:rFonts w:ascii="Arial" w:hAnsi="Arial"/>
-                <w:sz w:val="18"/>
+                <w:sz w:val="19"/>
               </w:rPr>
               <w:t>239.60</w:t>
             </w:r>
@@ -861,10 +831,10 @@
             <w:tcW w:type="dxa" w:w="2340"/>
             <w:shd w:fill="FFFFFF"/>
             <w:tcMar>
-              <w:top w:w="80" w:type="dxa"/>
-              <w:bottom w:w="80" w:type="dxa"/>
-              <w:left w:w="150" w:type="dxa"/>
-              <w:right w:w="150" w:type="dxa"/>
+              <w:top w:w="60" w:type="dxa"/>
+              <w:bottom w:w="60" w:type="dxa"/>
+              <w:left w:w="120" w:type="dxa"/>
+              <w:right w:w="120" w:type="dxa"/>
             </w:tcMar>
           </w:tcPr>
           <w:p>
@@ -874,7 +844,7 @@
             <w:r>
               <w:rPr>
                 <w:rFonts w:ascii="Arial" w:hAnsi="Arial"/>
-                <w:sz w:val="18"/>
+                <w:sz w:val="19"/>
               </w:rPr>
               <w:t>238.77</w:t>
             </w:r>
@@ -885,10 +855,10 @@
             <w:tcW w:type="dxa" w:w="2340"/>
             <w:shd w:fill="FFFFFF"/>
             <w:tcMar>
-              <w:top w:w="80" w:type="dxa"/>
-              <w:bottom w:w="80" w:type="dxa"/>
-              <w:left w:w="150" w:type="dxa"/>
-              <w:right w:w="150" w:type="dxa"/>
+              <w:top w:w="60" w:type="dxa"/>
+              <w:bottom w:w="60" w:type="dxa"/>
+              <w:left w:w="120" w:type="dxa"/>
+              <w:right w:w="120" w:type="dxa"/>
             </w:tcMar>
           </w:tcPr>
           <w:p>
@@ -898,7 +868,7 @@
             <w:r>
               <w:rPr>
                 <w:rFonts w:ascii="Arial" w:hAnsi="Arial"/>
-                <w:sz w:val="18"/>
+                <w:sz w:val="19"/>
               </w:rPr>
               <w:t>238.78</w:t>
             </w:r>
@@ -909,12 +879,12 @@
         <w:tc>
           <w:tcPr>
             <w:tcW w:type="dxa" w:w="2340"/>
-            <w:shd w:fill="F8F9FA"/>
+            <w:shd w:fill="F8FAFC"/>
             <w:tcMar>
-              <w:top w:w="80" w:type="dxa"/>
-              <w:bottom w:w="80" w:type="dxa"/>
-              <w:left w:w="150" w:type="dxa"/>
-              <w:right w:w="150" w:type="dxa"/>
+              <w:top w:w="60" w:type="dxa"/>
+              <w:bottom w:w="60" w:type="dxa"/>
+              <w:left w:w="120" w:type="dxa"/>
+              <w:right w:w="120" w:type="dxa"/>
             </w:tcMar>
           </w:tcPr>
           <w:p>
@@ -924,7 +894,7 @@
             <w:r>
               <w:rPr>
                 <w:rFonts w:ascii="Arial" w:hAnsi="Arial"/>
-                <w:sz w:val="18"/>
+                <w:sz w:val="19"/>
               </w:rPr>
               <w:t>2024-12-23</w:t>
             </w:r>
@@ -933,12 +903,12 @@
         <w:tc>
           <w:tcPr>
             <w:tcW w:type="dxa" w:w="2340"/>
-            <w:shd w:fill="F8F9FA"/>
+            <w:shd w:fill="F8FAFC"/>
             <w:tcMar>
-              <w:top w:w="80" w:type="dxa"/>
-              <w:bottom w:w="80" w:type="dxa"/>
-              <w:left w:w="150" w:type="dxa"/>
-              <w:right w:w="150" w:type="dxa"/>
+              <w:top w:w="60" w:type="dxa"/>
+              <w:bottom w:w="60" w:type="dxa"/>
+              <w:left w:w="120" w:type="dxa"/>
+              <w:right w:w="120" w:type="dxa"/>
             </w:tcMar>
           </w:tcPr>
           <w:p>
@@ -948,7 +918,7 @@
             <w:r>
               <w:rPr>
                 <w:rFonts w:ascii="Arial" w:hAnsi="Arial"/>
-                <w:sz w:val="18"/>
+                <w:sz w:val="19"/>
               </w:rPr>
               <w:t>241.44</w:t>
             </w:r>
@@ -957,12 +927,12 @@
         <w:tc>
           <w:tcPr>
             <w:tcW w:type="dxa" w:w="2340"/>
-            <w:shd w:fill="F8F9FA"/>
+            <w:shd w:fill="F8FAFC"/>
             <w:tcMar>
-              <w:top w:w="80" w:type="dxa"/>
-              <w:bottom w:w="80" w:type="dxa"/>
-              <w:left w:w="150" w:type="dxa"/>
-              <w:right w:w="150" w:type="dxa"/>
+              <w:top w:w="60" w:type="dxa"/>
+              <w:bottom w:w="60" w:type="dxa"/>
+              <w:left w:w="120" w:type="dxa"/>
+              <w:right w:w="120" w:type="dxa"/>
             </w:tcMar>
           </w:tcPr>
           <w:p>
@@ -972,7 +942,7 @@
             <w:r>
               <w:rPr>
                 <w:rFonts w:ascii="Arial" w:hAnsi="Arial"/>
-                <w:sz w:val="18"/>
+                <w:sz w:val="19"/>
               </w:rPr>
               <w:t>240.90</w:t>
             </w:r>
@@ -981,12 +951,12 @@
         <w:tc>
           <w:tcPr>
             <w:tcW w:type="dxa" w:w="2340"/>
-            <w:shd w:fill="F8F9FA"/>
+            <w:shd w:fill="F8FAFC"/>
             <w:tcMar>
-              <w:top w:w="80" w:type="dxa"/>
-              <w:bottom w:w="80" w:type="dxa"/>
-              <w:left w:w="150" w:type="dxa"/>
-              <w:right w:w="150" w:type="dxa"/>
+              <w:top w:w="60" w:type="dxa"/>
+              <w:bottom w:w="60" w:type="dxa"/>
+              <w:left w:w="120" w:type="dxa"/>
+              <w:right w:w="120" w:type="dxa"/>
             </w:tcMar>
           </w:tcPr>
           <w:p>
@@ -996,7 +966,7 @@
             <w:r>
               <w:rPr>
                 <w:rFonts w:ascii="Arial" w:hAnsi="Arial"/>
-                <w:sz w:val="18"/>
+                <w:sz w:val="19"/>
               </w:rPr>
               <w:t>240.90</w:t>
             </w:r>
@@ -1009,10 +979,10 @@
             <w:tcW w:type="dxa" w:w="2340"/>
             <w:shd w:fill="FFFFFF"/>
             <w:tcMar>
-              <w:top w:w="80" w:type="dxa"/>
-              <w:bottom w:w="80" w:type="dxa"/>
-              <w:left w:w="150" w:type="dxa"/>
-              <w:right w:w="150" w:type="dxa"/>
+              <w:top w:w="60" w:type="dxa"/>
+              <w:bottom w:w="60" w:type="dxa"/>
+              <w:left w:w="120" w:type="dxa"/>
+              <w:right w:w="120" w:type="dxa"/>
             </w:tcMar>
           </w:tcPr>
           <w:p>
@@ -1022,9 +992,9 @@
             <w:r>
               <w:rPr>
                 <w:rFonts w:ascii="Arial" w:hAnsi="Arial"/>
-                <w:sz w:val="18"/>
+                <w:sz w:val="19"/>
               </w:rPr>
-              <w:t>2024-12-26</w:t>
+              <w:t>2024-12-30</w:t>
             </w:r>
           </w:p>
         </w:tc>
@@ -1033,10 +1003,10 @@
             <w:tcW w:type="dxa" w:w="2340"/>
             <w:shd w:fill="FFFFFF"/>
             <w:tcMar>
-              <w:top w:w="80" w:type="dxa"/>
-              <w:bottom w:w="80" w:type="dxa"/>
-              <w:left w:w="150" w:type="dxa"/>
-              <w:right w:w="150" w:type="dxa"/>
+              <w:top w:w="60" w:type="dxa"/>
+              <w:bottom w:w="60" w:type="dxa"/>
+              <w:left w:w="120" w:type="dxa"/>
+              <w:right w:w="120" w:type="dxa"/>
             </w:tcMar>
           </w:tcPr>
           <w:p>
@@ -1046,9 +1016,9 @@
             <w:r>
               <w:rPr>
                 <w:rFonts w:ascii="Arial" w:hAnsi="Arial"/>
-                <w:sz w:val="18"/>
+                <w:sz w:val="19"/>
               </w:rPr>
-              <w:t>241.40</w:t>
+              <w:t>242.13</w:t>
             </w:r>
           </w:p>
         </w:tc>
@@ -1057,10 +1027,10 @@
             <w:tcW w:type="dxa" w:w="2340"/>
             <w:shd w:fill="FFFFFF"/>
             <w:tcMar>
-              <w:top w:w="80" w:type="dxa"/>
-              <w:bottom w:w="80" w:type="dxa"/>
-              <w:left w:w="150" w:type="dxa"/>
-              <w:right w:w="150" w:type="dxa"/>
+              <w:top w:w="60" w:type="dxa"/>
+              <w:bottom w:w="60" w:type="dxa"/>
+              <w:left w:w="120" w:type="dxa"/>
+              <w:right w:w="120" w:type="dxa"/>
             </w:tcMar>
           </w:tcPr>
           <w:p>
@@ -1070,9 +1040,9 @@
             <w:r>
               <w:rPr>
                 <w:rFonts w:ascii="Arial" w:hAnsi="Arial"/>
-                <w:sz w:val="18"/>
+                <w:sz w:val="19"/>
               </w:rPr>
-              <w:t>243.01</w:t>
+              <w:t>240.56</w:t>
             </w:r>
           </w:p>
         </w:tc>
@@ -1081,10 +1051,10 @@
             <w:tcW w:type="dxa" w:w="2340"/>
             <w:shd w:fill="FFFFFF"/>
             <w:tcMar>
-              <w:top w:w="80" w:type="dxa"/>
-              <w:bottom w:w="80" w:type="dxa"/>
-              <w:left w:w="150" w:type="dxa"/>
-              <w:right w:w="150" w:type="dxa"/>
+              <w:top w:w="60" w:type="dxa"/>
+              <w:bottom w:w="60" w:type="dxa"/>
+              <w:left w:w="120" w:type="dxa"/>
+              <w:right w:w="120" w:type="dxa"/>
             </w:tcMar>
           </w:tcPr>
           <w:p>
@@ -1094,105 +1064,7 @@
             <w:r>
               <w:rPr>
                 <w:rFonts w:ascii="Arial" w:hAnsi="Arial"/>
-                <w:sz w:val="18"/>
-              </w:rPr>
-              <w:t>243.01</w:t>
-            </w:r>
-          </w:p>
-        </w:tc>
-      </w:tr>
-      <w:tr>
-        <w:tc>
-          <w:tcPr>
-            <w:tcW w:type="dxa" w:w="2340"/>
-            <w:shd w:fill="F8F9FA"/>
-            <w:tcMar>
-              <w:top w:w="80" w:type="dxa"/>
-              <w:bottom w:w="80" w:type="dxa"/>
-              <w:left w:w="150" w:type="dxa"/>
-              <w:right w:w="150" w:type="dxa"/>
-            </w:tcMar>
-          </w:tcPr>
-          <w:p>
-            <w:pPr>
-              <w:jc w:val="center"/>
-            </w:pPr>
-            <w:r>
-              <w:rPr>
-                <w:rFonts w:ascii="Arial" w:hAnsi="Arial"/>
-                <w:sz w:val="18"/>
-              </w:rPr>
-              <w:t>2024-12-30</w:t>
-            </w:r>
-          </w:p>
-        </w:tc>
-        <w:tc>
-          <w:tcPr>
-            <w:tcW w:type="dxa" w:w="2340"/>
-            <w:shd w:fill="F8F9FA"/>
-            <w:tcMar>
-              <w:top w:w="80" w:type="dxa"/>
-              <w:bottom w:w="80" w:type="dxa"/>
-              <w:left w:w="150" w:type="dxa"/>
-              <w:right w:w="150" w:type="dxa"/>
-            </w:tcMar>
-          </w:tcPr>
-          <w:p>
-            <w:pPr>
-              <w:jc w:val="center"/>
-            </w:pPr>
-            <w:r>
-              <w:rPr>
-                <w:rFonts w:ascii="Arial" w:hAnsi="Arial"/>
-                <w:sz w:val="18"/>
-              </w:rPr>
-              <w:t>242.13</w:t>
-            </w:r>
-          </w:p>
-        </w:tc>
-        <w:tc>
-          <w:tcPr>
-            <w:tcW w:type="dxa" w:w="2340"/>
-            <w:shd w:fill="F8F9FA"/>
-            <w:tcMar>
-              <w:top w:w="80" w:type="dxa"/>
-              <w:bottom w:w="80" w:type="dxa"/>
-              <w:left w:w="150" w:type="dxa"/>
-              <w:right w:w="150" w:type="dxa"/>
-            </w:tcMar>
-          </w:tcPr>
-          <w:p>
-            <w:pPr>
-              <w:jc w:val="center"/>
-            </w:pPr>
-            <w:r>
-              <w:rPr>
-                <w:rFonts w:ascii="Arial" w:hAnsi="Arial"/>
-                <w:sz w:val="18"/>
-              </w:rPr>
-              <w:t>240.56</w:t>
-            </w:r>
-          </w:p>
-        </w:tc>
-        <w:tc>
-          <w:tcPr>
-            <w:tcW w:type="dxa" w:w="2340"/>
-            <w:shd w:fill="F8F9FA"/>
-            <w:tcMar>
-              <w:top w:w="80" w:type="dxa"/>
-              <w:bottom w:w="80" w:type="dxa"/>
-              <w:left w:w="150" w:type="dxa"/>
-              <w:right w:w="150" w:type="dxa"/>
-            </w:tcMar>
-          </w:tcPr>
-          <w:p>
-            <w:pPr>
-              <w:jc w:val="center"/>
-            </w:pPr>
-            <w:r>
-              <w:rPr>
-                <w:rFonts w:ascii="Arial" w:hAnsi="Arial"/>
-                <w:sz w:val="18"/>
+                <w:sz w:val="19"/>
               </w:rPr>
               <w:t>240.56</w:t>
             </w:r>
@@ -1202,32 +1074,32 @@
     </w:tbl>
     <w:p>
       <w:pPr>
-        <w:spacing w:after="240"/>
-      </w:pPr>
-    </w:p>
-    <w:p>
-      <w:pPr>
-        <w:pStyle w:val="Heading1"/>
-        <w:spacing w:before="240" w:after="80"/>
+        <w:spacing w:before="280" w:after="80"/>
       </w:pPr>
       <w:r>
         <w:rPr>
-          <w:rFonts w:ascii="Arial" w:hAnsi="Arial"/>
-          <w:color w:val="1A365D"/>
+          <w:rFonts w:ascii="B Nazanin" w:hAnsi="B Nazanin"/>
+          <w:b/>
+          <w:color w:val="003366"/>
+          <w:sz w:val="24"/>
         </w:rPr>
-        <w:t>5. Graphical Analysis &amp; Visual Benchmarks</w:t>
+        <w:t>۴. نمودارهای خروجی و بررسی خطاها</w:t>
       </w:r>
     </w:p>
     <w:p>
       <w:r>
-        <w:t>Figure 1: Comprehensive comparison of Actual vs. Predicted gold prices across the 352-day out-of-sample evaluation window:</w:t>
+        <w:rPr>
+          <w:rFonts w:ascii="B Nazanin" w:hAnsi="B Nazanin"/>
+          <w:sz w:val="22"/>
+        </w:rPr>
+        <w:t>نمودار مقایسه مقدار واقعی با مقادیر پیش‌بینی‌شده در شکل ۱ آورده شده است:</w:t>
       </w:r>
     </w:p>
     <w:p>
       <w:r>
         <w:drawing>
           <wp:inline xmlns:a="http://schemas.openxmlformats.org/drawingml/2006/main" xmlns:pic="http://schemas.openxmlformats.org/drawingml/2006/picture">
-            <wp:extent cx="5669280" cy="2834640"/>
+            <wp:extent cx="5303520" cy="2651760"/>
             <wp:docPr id="1" name="Picture 1"/>
             <wp:cNvGraphicFramePr>
               <a:graphicFrameLocks noChangeAspect="1"/>
@@ -1248,7 +1120,7 @@
                   <pic:spPr>
                     <a:xfrm>
                       <a:off x="0" y="0"/>
-                      <a:ext cx="5669280" cy="2834640"/>
+                      <a:ext cx="5303520" cy="2651760"/>
                     </a:xfrm>
                     <a:prstGeom prst="rect"/>
                   </pic:spPr>
@@ -1265,22 +1137,17 @@
       </w:pPr>
       <w:r>
         <w:rPr>
-          <w:i/>
-          <w:sz w:val="17"/>
+          <w:rFonts w:ascii="B Nazanin" w:hAnsi="B Nazanin"/>
+          <w:sz w:val="19"/>
         </w:rPr>
-        <w:t>Figure 1: SPDR Gold Shares (GLD) Actual vs. Predicted Next Day Closing Prices (Test Set: 2023-2024)</w:t>
+        <w:t>شکل ۱: نمودار قیمت واقعی طلا در مقایسه با پیش‌بینی رگرسیون خطی و ریج (داده‌های تست)</w:t>
       </w:r>
-    </w:p>
-    <w:p>
-      <w:pPr>
-        <w:spacing w:after="160"/>
-      </w:pPr>
     </w:p>
     <w:p>
       <w:r>
         <w:drawing>
           <wp:inline xmlns:a="http://schemas.openxmlformats.org/drawingml/2006/main" xmlns:pic="http://schemas.openxmlformats.org/drawingml/2006/picture">
-            <wp:extent cx="5669280" cy="2024743"/>
+            <wp:extent cx="5303520" cy="1894114"/>
             <wp:docPr id="2" name="Picture 2"/>
             <wp:cNvGraphicFramePr>
               <a:graphicFrameLocks noChangeAspect="1"/>
@@ -1301,7 +1168,7 @@
                   <pic:spPr>
                     <a:xfrm>
                       <a:off x="0" y="0"/>
-                      <a:ext cx="5669280" cy="2024743"/>
+                      <a:ext cx="5303520" cy="1894114"/>
                     </a:xfrm>
                     <a:prstGeom prst="rect"/>
                   </pic:spPr>
@@ -1318,34 +1185,36 @@
       </w:pPr>
       <w:r>
         <w:rPr>
-          <w:i/>
-          <w:sz w:val="17"/>
+          <w:rFonts w:ascii="B Nazanin" w:hAnsi="B Nazanin"/>
+          <w:sz w:val="19"/>
         </w:rPr>
-        <w:t>Figure 2: Residual Distribution and Error Fluctuation Over Time</w:t>
+        <w:t>شکل ۲: نمودار خطای پیش‌بینی (Residuals) در طول زمان</w:t>
       </w:r>
     </w:p>
     <w:p>
       <w:pPr>
-        <w:pStyle w:val="Heading1"/>
-        <w:spacing w:before="240" w:after="80"/>
+        <w:spacing w:before="280" w:after="80"/>
       </w:pPr>
       <w:r>
         <w:rPr>
-          <w:rFonts w:ascii="Arial" w:hAnsi="Arial"/>
-          <w:color w:val="1A365D"/>
+          <w:rFonts w:ascii="B Nazanin" w:hAnsi="B Nazanin"/>
+          <w:b/>
+          <w:color w:val="003366"/>
+          <w:sz w:val="24"/>
         </w:rPr>
-        <w:t>6. Technical Insights &amp; Conclusion</w:t>
+        <w:t>۵. نتیجه‌گیری و تحلیل نتایج</w:t>
       </w:r>
     </w:p>
     <w:p>
+      <w:pPr>
+        <w:spacing w:line="288" w:lineRule="auto"/>
+      </w:pPr>
       <w:r>
-        <w:t>1. Performance Parity: Both Linear Regression and Ridge Regression achieve an impressive R² of 0.9938 and an MAE of approximately 1.47 USD, confirming that linear feature relationships strongly predict short-term next-day market closures.</w:t>
-        <w:br/>
-        <w:t>2. Regularization Impact: Ridge Regression slightly improves RMSE from 1.9759 to 1.9757 USD, demonstrating that penalizing coefficient magnitudes provides a slight buffer against unexpected outlier fluctuations.</w:t>
-        <w:br/>
-        <w:t>3. Market Efficiency &amp; Lag Dynamics: Analysis of residuals reveals that next-day price movements are highly correlated with current closing price, reflecting standard random-walk financial characteristics where previous closing price serves as a potent baseline.</w:t>
-        <w:br/>
-        <w:t>4. Conclusion: The models deliver robust, production-grade baseline predictive performance on GLD historical data, fully satisfying all academic requirements of Assignment #1.</w:t>
+        <w:rPr>
+          <w:rFonts w:ascii="B Nazanin" w:hAnsi="B Nazanin"/>
+          <w:sz w:val="23"/>
+        </w:rPr>
+        <w:t>با توجه به نتایج به‌دست‌آمده، ضریب تعیین بالا (حدود ۰.۹۹۳۸) نشان می‌دهد ویژگی‌های روز جاری و به‌ویژه قیمت پایانی، همبستگی بسیار شدیدی با قیمت روز بعد دارند. مدل ریج با اعمال جریمه L2 مقداری اندک خطای RMSE را کاهش داده است (از ۱.۹۷۵۹ به ۱.۹۷۵۷ دلار) که نشان‌دهنده کنترل اندک وزن‌ها در زمان نوسانات ناگهانی بازار است. با این حال، نمودار خطاها نشان می‌دهد که مدل‌ها بیشتر به عنوان یک تخمین‌گر پایه‌ای عمل می‌کنند و در روزهایی که بازار طلا نوسان یا شوک خبری ناگهانی دارد، خطای پیش‌بینی افزایش پیدا می‌کند.</w:t>
       </w:r>
     </w:p>
     <w:sectPr>

</xml_diff>

<commit_message>
style: apply full right-to-left layout and B Nazanin typography to report
</commit_message>
<xml_diff>
--- a/Gold_Price_Regression_Report.docx
+++ b/Gold_Price_Regression_Report.docx
@@ -4,6 +4,7 @@
   <w:body>
     <w:p>
       <w:pPr>
+        <w:bidi/>
         <w:spacing w:after="40"/>
         <w:jc w:val="center"/>
       </w:pPr>
@@ -12,6 +13,7 @@
           <w:rFonts w:ascii="B Nazanin" w:hAnsi="B Nazanin"/>
           <w:b/>
           <w:sz w:val="28"/>
+          <w:rtl/>
         </w:rPr>
         <w:t>دانشگاه ارومیه - دانشکده فنی و مهندسی</w:t>
         <w:br/>
@@ -21,6 +23,7 @@
     </w:p>
     <w:p>
       <w:pPr>
+        <w:bidi/>
         <w:spacing w:after="120"/>
         <w:jc w:val="center"/>
       </w:pPr>
@@ -29,12 +32,14 @@
           <w:rFonts w:ascii="B Nazanin" w:hAnsi="B Nazanin"/>
           <w:b/>
           <w:sz w:val="26"/>
+          <w:rtl/>
         </w:rPr>
         <w:t>گزارش تمرین اول: پیش‌بینی قیمت طلا با مدل‌های رگرسیون خطی و ریج (Ridge)</w:t>
       </w:r>
     </w:p>
     <w:p>
       <w:pPr>
+        <w:bidi/>
         <w:spacing w:after="240"/>
         <w:jc w:val="center"/>
       </w:pPr>
@@ -42,6 +47,7 @@
         <w:rPr>
           <w:rFonts w:ascii="B Nazanin" w:hAnsi="B Nazanin"/>
           <w:sz w:val="22"/>
+          <w:rtl/>
         </w:rPr>
         <w:t>نام دانشجو: متین سجودی | شماره دانشجویی: 14014421025</w:t>
         <w:br/>
@@ -58,88 +64,106 @@
     </w:p>
     <w:p>
       <w:pPr>
+        <w:bidi/>
         <w:spacing w:before="280" w:after="80"/>
+        <w:jc w:val="right"/>
       </w:pPr>
       <w:r>
         <w:rPr>
           <w:rFonts w:ascii="B Nazanin" w:hAnsi="B Nazanin"/>
           <w:b/>
           <w:color w:val="003366"/>
-          <w:sz w:val="24"/>
+          <w:sz w:val="25"/>
+          <w:rtl/>
         </w:rPr>
-        <w:t>۱. مقدمه و صورت مسئله</w:t>
+        <w:t>۱. مقدمه و بیان مسئله</w:t>
       </w:r>
     </w:p>
     <w:p>
       <w:pPr>
-        <w:spacing w:line="288" w:lineRule="auto"/>
+        <w:bidi/>
+        <w:spacing w:line="300" w:lineRule="auto" w:after="80"/>
+        <w:jc w:val="both"/>
       </w:pPr>
       <w:r>
         <w:rPr>
           <w:rFonts w:ascii="B Nazanin" w:hAnsi="B Nazanin"/>
-          <w:sz w:val="23"/>
+          <w:sz w:val="24"/>
+          <w:rtl/>
         </w:rPr>
-        <w:t>در این تمرین، هدف پیش‌بینی قیمت پایانی (Close) روز بعد طلا با استفاده از ویژگی‌های معاملات روز جاری است. داده‌های استفاده شده مربوط به صندوق طلای SPDR (نماد GLD) در بازه زمانی سال‌های ۲۰۱۸ تا انتهای ۲۰۲۴ (حدود ۷ سال معامله روزانه) می‌باشد. برای مدلسازی، دو روش رگرسیون خطی معمولی (Linear Regression) و رگرسیون ریج با جریمه لایه دوم (Ridge Regression) پیاده‌سازی و عملکرد آنها با هم مقایسه شده است.</w:t>
+        <w:t>در این تمرین هدف اصلی، بررسی و ارزیابی توانایی مدل‌های رگرسیون پایه در پیش‌بینی قیمت بسته شدن (Close) روز بعد طلا بر اساس متغیرهای معاملاتی روز جاری است. مجموعه داده مورد استفاده مربوط به صندوق طلای SPDR (نماد GLD) در بازه زمانی سال‌های ۲۰۱۸ تا انتهای ۲۰۲۴ (حدود ۷ سال داده روزانه بازار) می‌باشد. در این پروژه دو مدل رگرسیون خطی معمولی (Linear Regression) و رگرسیون ریج با جریمه لایه دوم (Ridge Regression) پیاده‌سازی شده و نتایج آنها با معیارهای استاندارد مقایسه شده است.</w:t>
       </w:r>
     </w:p>
     <w:p>
       <w:pPr>
+        <w:bidi/>
         <w:spacing w:before="280" w:after="80"/>
+        <w:jc w:val="right"/>
       </w:pPr>
       <w:r>
         <w:rPr>
           <w:rFonts w:ascii="B Nazanin" w:hAnsi="B Nazanin"/>
           <w:b/>
           <w:color w:val="003366"/>
-          <w:sz w:val="24"/>
+          <w:sz w:val="25"/>
+          <w:rtl/>
         </w:rPr>
         <w:t>۲. پیش‌پردازش داده‌ها و آماده‌سازی برای آموزش</w:t>
       </w:r>
     </w:p>
     <w:p>
       <w:pPr>
-        <w:spacing w:line="288" w:lineRule="auto"/>
+        <w:bidi/>
+        <w:spacing w:line="300" w:lineRule="auto" w:after="80"/>
+        <w:jc w:val="both"/>
       </w:pPr>
       <w:r>
         <w:rPr>
           <w:rFonts w:ascii="B Nazanin" w:hAnsi="B Nazanin"/>
-          <w:sz w:val="23"/>
+          <w:sz w:val="24"/>
+          <w:rtl/>
         </w:rPr>
-        <w:t>مراحل آماده‌سازی داده‌ها به شرح زیر انجام شد:</w:t>
+        <w:t>مراحل آماده‌سازی داده‌ها به شرح زیر انجام گرفت:</w:t>
         <w:br/>
-        <w:t>۱. مرتب‌سازی زمانی: ابتدا فایل داده‌های GLD بر اساس ستون تاریخ مرتب شد تا ترتیبات زمانی داده‌ها حفظ شود.</w:t>
+        <w:t>۱. مرتب‌سازی زمانی: ابتدا فایل داده‌های GLD بر اساس ستون تاریخ مرتب شد تا تقدم و تاخر روزهای معاملاتی حفظ شود.</w:t>
         <w:br/>
-        <w:t>۲. ساخت متغیر هدف: قیمت Close با یک گام شیفت زمانی به عقب (shift(-1)) به عنوان قیمت روز بعد (Next_Close) تعریف شد. سطر آخر به دلیل خالی بودن مقدار روز بعد از مجموعه حذف گردید که در نهایت ۱۷۶۰ سطر معتبر باقی ماند.</w:t>
+        <w:t>۲. ساخت متغیر هدف: قیمت پایانی با یک گام شیفت زمانی به عقب (shift(-1)) به عنوان قیمت روز بعد (Next_Close) در نظر گرفته شد. سطر آخر به دلیل نامشخص بودن قیمت روز بعد از مجموعه حذف گردید و در نهایت ۱۷۶۰ سطر معتبر به دست آمد.</w:t>
         <w:br/>
-        <w:t>۳. مقیاس‌بندی ویژگی حجم: ستون Volume به دلیل مقادیر عددی بزرگ (میلیونی) به مقیاس میلیون واحد تبدیل شد تا از خطاهای سرریز محاسباتی جلوگیری شود.</w:t>
+        <w:t>۳. مقیاس‌بندی ویژگی حجم: ستون Volume به دلیل داشتن مقادیر بسیار بزرگ (میلیونی) به مقیاس میلیون واحد تبدیل شد تا از خطای محاسباتی ماتریسی جلوگیری شود.</w:t>
         <w:br/>
-        <w:t>۴. تقسیم به دو بخش آموزش و آزمایش: برای رعایت ماهیت سری‌های زمانی، داده‌ها بدون جابجایی تصادفی (بدون Shuffle) به نسبت ۸۰ درصد داده‌های اولیه برای آموزش (۱۴۰۸ نمونه از اوایل ۲۰۱۸ تا مرداد ۱۴۰۲) و ۲۰ درصد انتهایی برای آزمایش (۳۵۲ نمونه از مرداد ۱۴۰۲ تا پایان ۲۰۲۴) تقسیم شدند.</w:t>
+        <w:t>۴. تقسیم به داده‌های آموزش و آزمایش: برای رعایت ماهیت سری‌های زمانی، داده‌ها بدون جابجایی تصادفی (بدون Shuffle) تقسیم شدند؛ ۸۰ درصد داده‌های اولیه (۱۴۰۸ نمونه از اوایل ۲۰۱۸ تا مرداد ۱۴۰۲) برای آموزش مدل و ۲۰ درصد انتهایی (۳۵۲ نمونه از مرداد ۱۴۰۲ تا پایان ۲۰۲۴) برای ارزیابی مدل‌ها اختصاص داده شد.</w:t>
       </w:r>
     </w:p>
     <w:p>
       <w:pPr>
+        <w:bidi/>
         <w:spacing w:before="280" w:after="80"/>
+        <w:jc w:val="right"/>
       </w:pPr>
       <w:r>
         <w:rPr>
           <w:rFonts w:ascii="B Nazanin" w:hAnsi="B Nazanin"/>
           <w:b/>
           <w:color w:val="003366"/>
-          <w:sz w:val="24"/>
+          <w:sz w:val="25"/>
+          <w:rtl/>
         </w:rPr>
         <w:t>۳. آموزش مدل‌ها و معیارهای ارزیابی</w:t>
       </w:r>
     </w:p>
     <w:p>
       <w:pPr>
-        <w:spacing w:line="288" w:lineRule="auto"/>
+        <w:bidi/>
+        <w:spacing w:line="300" w:lineRule="auto" w:after="80"/>
+        <w:jc w:val="both"/>
       </w:pPr>
       <w:r>
         <w:rPr>
           <w:rFonts w:ascii="B Nazanin" w:hAnsi="B Nazanin"/>
-          <w:sz w:val="23"/>
+          <w:sz w:val="24"/>
+          <w:rtl/>
         </w:rPr>
-        <w:t>هر دو مدل با کتابخانه scikit-learn روی مجموعه آموزش برازش داده شدند و سپس قیمت‌های روز بعد برای داده‌های تست پیش‌بینی شد. معیارهای محاسبه‌شده شامل میانگین قدرمطلق خطا (MAE)، ریشه میانگین مربعات خطا (RMSE) و ضریب تعیین (R2) هستند:</w:t>
+        <w:t>مدل‌های Linear Regression و Ridge Regression با استفاده از کتابخانه scikit-learn روی داده‌های آموزش برازش داده شدند و سپس قیمت‌های روز بعد برای داده‌های آزمون پیش‌بینی شدند. معیارهای مورد بررسی شامل میانگین قدرمطلق خطا (MAE)، ریشه میانگین مربعات خطا (RMSE) و ضریب تعیین (R2) هستند:</w:t>
       </w:r>
     </w:p>
     <w:tbl>
@@ -147,6 +171,7 @@
         <w:tblW w:type="auto" w:w="0"/>
         <w:jc w:val="center"/>
         <w:tblLook w:firstColumn="1" w:firstRow="1" w:lastColumn="0" w:lastRow="0" w:noHBand="0" w:noVBand="1" w:val="04A0"/>
+        <w:bidiVisual/>
       </w:tblPr>
       <w:tblGrid>
         <w:gridCol w:w="2340"/>
@@ -168,6 +193,7 @@
           </w:tcPr>
           <w:p>
             <w:pPr>
+              <w:bidi/>
               <w:jc w:val="center"/>
             </w:pPr>
             <w:r>
@@ -175,6 +201,7 @@
                 <w:rFonts w:ascii="B Nazanin" w:hAnsi="B Nazanin"/>
                 <w:b/>
                 <w:sz w:val="21"/>
+                <w:rtl/>
               </w:rPr>
               <w:t>مدل رگرسیون</w:t>
             </w:r>
@@ -193,6 +220,7 @@
           </w:tcPr>
           <w:p>
             <w:pPr>
+              <w:bidi/>
               <w:jc w:val="center"/>
             </w:pPr>
             <w:r>
@@ -200,6 +228,7 @@
                 <w:rFonts w:ascii="B Nazanin" w:hAnsi="B Nazanin"/>
                 <w:b/>
                 <w:sz w:val="21"/>
+                <w:rtl/>
               </w:rPr>
               <w:t>MAE (دلار)</w:t>
             </w:r>
@@ -218,6 +247,7 @@
           </w:tcPr>
           <w:p>
             <w:pPr>
+              <w:bidi/>
               <w:jc w:val="center"/>
             </w:pPr>
             <w:r>
@@ -225,6 +255,7 @@
                 <w:rFonts w:ascii="B Nazanin" w:hAnsi="B Nazanin"/>
                 <w:b/>
                 <w:sz w:val="21"/>
+                <w:rtl/>
               </w:rPr>
               <w:t>RMSE (دلار)</w:t>
             </w:r>
@@ -243,6 +274,7 @@
           </w:tcPr>
           <w:p>
             <w:pPr>
+              <w:bidi/>
               <w:jc w:val="center"/>
             </w:pPr>
             <w:r>
@@ -250,6 +282,7 @@
                 <w:rFonts w:ascii="B Nazanin" w:hAnsi="B Nazanin"/>
                 <w:b/>
                 <w:sz w:val="21"/>
+                <w:rtl/>
               </w:rPr>
               <w:t>ضریب تعیین (R²)</w:t>
             </w:r>
@@ -270,6 +303,7 @@
           </w:tcPr>
           <w:p>
             <w:pPr>
+              <w:bidi/>
               <w:jc w:val="center"/>
             </w:pPr>
             <w:r>
@@ -294,6 +328,7 @@
           </w:tcPr>
           <w:p>
             <w:pPr>
+              <w:bidi/>
               <w:jc w:val="center"/>
             </w:pPr>
             <w:r>
@@ -318,6 +353,7 @@
           </w:tcPr>
           <w:p>
             <w:pPr>
+              <w:bidi/>
               <w:jc w:val="center"/>
             </w:pPr>
             <w:r>
@@ -342,6 +378,7 @@
           </w:tcPr>
           <w:p>
             <w:pPr>
+              <w:bidi/>
               <w:jc w:val="center"/>
             </w:pPr>
             <w:r>
@@ -368,6 +405,7 @@
           </w:tcPr>
           <w:p>
             <w:pPr>
+              <w:bidi/>
               <w:jc w:val="center"/>
             </w:pPr>
             <w:r>
@@ -392,6 +430,7 @@
           </w:tcPr>
           <w:p>
             <w:pPr>
+              <w:bidi/>
               <w:jc w:val="center"/>
             </w:pPr>
             <w:r>
@@ -416,6 +455,7 @@
           </w:tcPr>
           <w:p>
             <w:pPr>
+              <w:bidi/>
               <w:jc w:val="center"/>
             </w:pPr>
             <w:r>
@@ -440,6 +480,7 @@
           </w:tcPr>
           <w:p>
             <w:pPr>
+              <w:bidi/>
               <w:jc w:val="center"/>
             </w:pPr>
             <w:r>
@@ -459,10 +500,15 @@
       </w:pPr>
     </w:p>
     <w:p>
+      <w:pPr>
+        <w:bidi/>
+        <w:jc w:val="right"/>
+      </w:pPr>
       <w:r>
         <w:rPr>
           <w:rFonts w:ascii="B Nazanin" w:hAnsi="B Nazanin"/>
-          <w:sz w:val="21"/>
+          <w:sz w:val="22"/>
+          <w:rtl/>
         </w:rPr>
         <w:t>جدول ۲: مقایسه نمونه‌ای از قیمت واقعی روز بعد با پیش‌بینی دو مدل روی داده‌های تست:</w:t>
       </w:r>
@@ -472,6 +518,7 @@
         <w:tblW w:type="auto" w:w="0"/>
         <w:jc w:val="center"/>
         <w:tblLook w:firstColumn="1" w:firstRow="1" w:lastColumn="0" w:lastRow="0" w:noHBand="0" w:noVBand="1" w:val="04A0"/>
+        <w:bidiVisual/>
       </w:tblPr>
       <w:tblGrid>
         <w:gridCol w:w="2340"/>
@@ -493,6 +540,7 @@
           </w:tcPr>
           <w:p>
             <w:pPr>
+              <w:bidi/>
               <w:jc w:val="center"/>
             </w:pPr>
             <w:r>
@@ -500,6 +548,7 @@
                 <w:rFonts w:ascii="B Nazanin" w:hAnsi="B Nazanin"/>
                 <w:b/>
                 <w:sz w:val="20"/>
+                <w:rtl/>
               </w:rPr>
               <w:t>تاریخ</w:t>
             </w:r>
@@ -518,6 +567,7 @@
           </w:tcPr>
           <w:p>
             <w:pPr>
+              <w:bidi/>
               <w:jc w:val="center"/>
             </w:pPr>
             <w:r>
@@ -525,6 +575,7 @@
                 <w:rFonts w:ascii="B Nazanin" w:hAnsi="B Nazanin"/>
                 <w:b/>
                 <w:sz w:val="20"/>
+                <w:rtl/>
               </w:rPr>
               <w:t>قیمت واقعی (دلار)</w:t>
             </w:r>
@@ -543,6 +594,7 @@
           </w:tcPr>
           <w:p>
             <w:pPr>
+              <w:bidi/>
               <w:jc w:val="center"/>
             </w:pPr>
             <w:r>
@@ -550,6 +602,7 @@
                 <w:rFonts w:ascii="B Nazanin" w:hAnsi="B Nazanin"/>
                 <w:b/>
                 <w:sz w:val="20"/>
+                <w:rtl/>
               </w:rPr>
               <w:t>پیش‌بینی Linear</w:t>
             </w:r>
@@ -568,6 +621,7 @@
           </w:tcPr>
           <w:p>
             <w:pPr>
+              <w:bidi/>
               <w:jc w:val="center"/>
             </w:pPr>
             <w:r>
@@ -575,6 +629,7 @@
                 <w:rFonts w:ascii="B Nazanin" w:hAnsi="B Nazanin"/>
                 <w:b/>
                 <w:sz w:val="20"/>
+                <w:rtl/>
               </w:rPr>
               <w:t>پیش‌بینی Ridge</w:t>
             </w:r>
@@ -595,6 +650,7 @@
           </w:tcPr>
           <w:p>
             <w:pPr>
+              <w:bidi/>
               <w:jc w:val="center"/>
             </w:pPr>
             <w:r>
@@ -619,6 +675,7 @@
           </w:tcPr>
           <w:p>
             <w:pPr>
+              <w:bidi/>
               <w:jc w:val="center"/>
             </w:pPr>
             <w:r>
@@ -643,6 +700,7 @@
           </w:tcPr>
           <w:p>
             <w:pPr>
+              <w:bidi/>
               <w:jc w:val="center"/>
             </w:pPr>
             <w:r>
@@ -667,6 +725,7 @@
           </w:tcPr>
           <w:p>
             <w:pPr>
+              <w:bidi/>
               <w:jc w:val="center"/>
             </w:pPr>
             <w:r>
@@ -693,6 +752,7 @@
           </w:tcPr>
           <w:p>
             <w:pPr>
+              <w:bidi/>
               <w:jc w:val="center"/>
             </w:pPr>
             <w:r>
@@ -717,6 +777,7 @@
           </w:tcPr>
           <w:p>
             <w:pPr>
+              <w:bidi/>
               <w:jc w:val="center"/>
             </w:pPr>
             <w:r>
@@ -741,6 +802,7 @@
           </w:tcPr>
           <w:p>
             <w:pPr>
+              <w:bidi/>
               <w:jc w:val="center"/>
             </w:pPr>
             <w:r>
@@ -765,6 +827,7 @@
           </w:tcPr>
           <w:p>
             <w:pPr>
+              <w:bidi/>
               <w:jc w:val="center"/>
             </w:pPr>
             <w:r>
@@ -791,6 +854,7 @@
           </w:tcPr>
           <w:p>
             <w:pPr>
+              <w:bidi/>
               <w:jc w:val="center"/>
             </w:pPr>
             <w:r>
@@ -815,6 +879,7 @@
           </w:tcPr>
           <w:p>
             <w:pPr>
+              <w:bidi/>
               <w:jc w:val="center"/>
             </w:pPr>
             <w:r>
@@ -839,6 +904,7 @@
           </w:tcPr>
           <w:p>
             <w:pPr>
+              <w:bidi/>
               <w:jc w:val="center"/>
             </w:pPr>
             <w:r>
@@ -863,6 +929,7 @@
           </w:tcPr>
           <w:p>
             <w:pPr>
+              <w:bidi/>
               <w:jc w:val="center"/>
             </w:pPr>
             <w:r>
@@ -889,6 +956,7 @@
           </w:tcPr>
           <w:p>
             <w:pPr>
+              <w:bidi/>
               <w:jc w:val="center"/>
             </w:pPr>
             <w:r>
@@ -913,6 +981,7 @@
           </w:tcPr>
           <w:p>
             <w:pPr>
+              <w:bidi/>
               <w:jc w:val="center"/>
             </w:pPr>
             <w:r>
@@ -937,6 +1006,7 @@
           </w:tcPr>
           <w:p>
             <w:pPr>
+              <w:bidi/>
               <w:jc w:val="center"/>
             </w:pPr>
             <w:r>
@@ -961,6 +1031,7 @@
           </w:tcPr>
           <w:p>
             <w:pPr>
+              <w:bidi/>
               <w:jc w:val="center"/>
             </w:pPr>
             <w:r>
@@ -987,6 +1058,7 @@
           </w:tcPr>
           <w:p>
             <w:pPr>
+              <w:bidi/>
               <w:jc w:val="center"/>
             </w:pPr>
             <w:r>
@@ -1011,6 +1083,7 @@
           </w:tcPr>
           <w:p>
             <w:pPr>
+              <w:bidi/>
               <w:jc w:val="center"/>
             </w:pPr>
             <w:r>
@@ -1035,6 +1108,7 @@
           </w:tcPr>
           <w:p>
             <w:pPr>
+              <w:bidi/>
               <w:jc w:val="center"/>
             </w:pPr>
             <w:r>
@@ -1059,6 +1133,7 @@
           </w:tcPr>
           <w:p>
             <w:pPr>
+              <w:bidi/>
               <w:jc w:val="center"/>
             </w:pPr>
             <w:r>
@@ -1074,25 +1149,33 @@
     </w:tbl>
     <w:p>
       <w:pPr>
+        <w:bidi/>
         <w:spacing w:before="280" w:after="80"/>
+        <w:jc w:val="right"/>
       </w:pPr>
       <w:r>
         <w:rPr>
           <w:rFonts w:ascii="B Nazanin" w:hAnsi="B Nazanin"/>
           <w:b/>
           <w:color w:val="003366"/>
-          <w:sz w:val="24"/>
+          <w:sz w:val="25"/>
+          <w:rtl/>
         </w:rPr>
         <w:t>۴. نمودارهای خروجی و بررسی خطاها</w:t>
       </w:r>
     </w:p>
     <w:p>
+      <w:pPr>
+        <w:bidi/>
+        <w:jc w:val="right"/>
+      </w:pPr>
       <w:r>
         <w:rPr>
           <w:rFonts w:ascii="B Nazanin" w:hAnsi="B Nazanin"/>
           <w:sz w:val="22"/>
+          <w:rtl/>
         </w:rPr>
-        <w:t>نمودار مقایسه مقدار واقعی با مقادیر پیش‌بینی‌شده در شکل ۱ آورده شده است:</w:t>
+        <w:t>نمودار مقایسه مقدار واقعی با مقادیر پیش‌بینی‌شده در شکل ۱ نمایش داده شده است:</w:t>
       </w:r>
     </w:p>
     <w:p>
@@ -1133,12 +1216,14 @@
     </w:p>
     <w:p>
       <w:pPr>
+        <w:bidi/>
         <w:jc w:val="center"/>
       </w:pPr>
       <w:r>
         <w:rPr>
           <w:rFonts w:ascii="B Nazanin" w:hAnsi="B Nazanin"/>
           <w:sz w:val="19"/>
+          <w:rtl/>
         </w:rPr>
         <w:t>شکل ۱: نمودار قیمت واقعی طلا در مقایسه با پیش‌بینی رگرسیون خطی و ریج (داده‌های تست)</w:t>
       </w:r>
@@ -1181,40 +1266,48 @@
     </w:p>
     <w:p>
       <w:pPr>
+        <w:bidi/>
         <w:jc w:val="center"/>
       </w:pPr>
       <w:r>
         <w:rPr>
           <w:rFonts w:ascii="B Nazanin" w:hAnsi="B Nazanin"/>
           <w:sz w:val="19"/>
+          <w:rtl/>
         </w:rPr>
         <w:t>شکل ۲: نمودار خطای پیش‌بینی (Residuals) در طول زمان</w:t>
       </w:r>
     </w:p>
     <w:p>
       <w:pPr>
+        <w:bidi/>
         <w:spacing w:before="280" w:after="80"/>
+        <w:jc w:val="right"/>
       </w:pPr>
       <w:r>
         <w:rPr>
           <w:rFonts w:ascii="B Nazanin" w:hAnsi="B Nazanin"/>
           <w:b/>
           <w:color w:val="003366"/>
-          <w:sz w:val="24"/>
+          <w:sz w:val="25"/>
+          <w:rtl/>
         </w:rPr>
         <w:t>۵. نتیجه‌گیری و تحلیل نتایج</w:t>
       </w:r>
     </w:p>
     <w:p>
       <w:pPr>
-        <w:spacing w:line="288" w:lineRule="auto"/>
+        <w:bidi/>
+        <w:spacing w:line="300" w:lineRule="auto" w:after="80"/>
+        <w:jc w:val="both"/>
       </w:pPr>
       <w:r>
         <w:rPr>
           <w:rFonts w:ascii="B Nazanin" w:hAnsi="B Nazanin"/>
-          <w:sz w:val="23"/>
+          <w:sz w:val="24"/>
+          <w:rtl/>
         </w:rPr>
-        <w:t>با توجه به نتایج به‌دست‌آمده، ضریب تعیین بالا (حدود ۰.۹۹۳۸) نشان می‌دهد ویژگی‌های روز جاری و به‌ویژه قیمت پایانی، همبستگی بسیار شدیدی با قیمت روز بعد دارند. مدل ریج با اعمال جریمه L2 مقداری اندک خطای RMSE را کاهش داده است (از ۱.۹۷۵۹ به ۱.۹۷۵۷ دلار) که نشان‌دهنده کنترل اندک وزن‌ها در زمان نوسانات ناگهانی بازار است. با این حال، نمودار خطاها نشان می‌دهد که مدل‌ها بیشتر به عنوان یک تخمین‌گر پایه‌ای عمل می‌کنند و در روزهایی که بازار طلا نوسان یا شوک خبری ناگهانی دارد، خطای پیش‌بینی افزایش پیدا می‌کند.</w:t>
+        <w:t>با توجه به نتایج حاصل، ضریب تعیین بالا (حدود ۰.۹۹۳۸) نشان می‌دهد قیمت پایانی روز جاری همبستگی خطی بسیار بالایی با قیمت روز بعد دارد. مدل ریج با اعمال جریمه L2 توانسته خطای RMSE را به مقدار کمی کاهش دهد (از ۱.۹۷۵۹ به ۱.۹۷۵۷ دلار) که نشان‌دهنده جلوگیری نسبی از وزن‌دهی نامتعادل به ویژگی‌ها است. بررسی خطاهای باقیمانده (Residuals) مشخص می‌کند که مدل‌های رگرسیون خطی به عنوان یک مبنای سریع و خوب عمل می‌کنند اما توانایی پیش‌بینی شوک‌های ناگهانی بازار و روندهای غیرخطی شدید را ندارند.</w:t>
       </w:r>
     </w:p>
     <w:sectPr>

</xml_diff>

<commit_message>
style: align all headers and titles to right-to-left layout
</commit_message>
<xml_diff>
--- a/Gold_Price_Regression_Report.docx
+++ b/Gold_Price_Regression_Report.docx
@@ -6,7 +6,7 @@
       <w:pPr>
         <w:bidi/>
         <w:spacing w:after="40"/>
-        <w:jc w:val="center"/>
+        <w:jc w:val="right"/>
       </w:pPr>
       <w:r>
         <w:rPr>
@@ -25,7 +25,7 @@
       <w:pPr>
         <w:bidi/>
         <w:spacing w:after="120"/>
-        <w:jc w:val="center"/>
+        <w:jc w:val="right"/>
       </w:pPr>
       <w:r>
         <w:rPr>
@@ -41,7 +41,7 @@
       <w:pPr>
         <w:bidi/>
         <w:spacing w:after="240"/>
-        <w:jc w:val="center"/>
+        <w:jc w:val="right"/>
       </w:pPr>
       <w:r>
         <w:rPr>
@@ -56,7 +56,7 @@
     </w:p>
     <w:p>
       <w:pPr>
-        <w:jc w:val="center"/>
+        <w:jc w:val="right"/>
       </w:pPr>
       <w:r>
         <w:t>---------------------------------------------------------------------------------------------------------</w:t>
@@ -1217,7 +1217,7 @@
     <w:p>
       <w:pPr>
         <w:bidi/>
-        <w:jc w:val="center"/>
+        <w:jc w:val="right"/>
       </w:pPr>
       <w:r>
         <w:rPr>
@@ -1267,7 +1267,7 @@
     <w:p>
       <w:pPr>
         <w:bidi/>
-        <w:jc w:val="center"/>
+        <w:jc w:val="right"/>
       </w:pPr>
       <w:r>
         <w:rPr>

</xml_diff>